<commit_message>
docs: remove Vercel, add Telegram→OpenClaw remote flow diagram
- Remove all Vercel references from manual (incompatible with local-only arch)
- Add Telegram→OpenClaw→Claude Code→Local RAG visual flow diagram in ch.6
- Add explanation box: why Vercel/cloud deployment is impossible for this stack
- Update AI tools table: replace Vercel with Telegram channel entry
- Update chapter 7 deployment section with security rationale
- Update footer credit line

Co-Authored-By: Claude Sonnet 4.6 <noreply@anthropic.com>
</commit_message>
<xml_diff>
--- a/MANUAL.docx
+++ b/MANUAL.docx
@@ -5425,7 +5425,7 @@
                 <w:color w:val="404040"/>
                 <w:sz w:val="19"/>
               </w:rPr>
-              <w:t>🦅  OpenClaw 에이전트</w:t>
+              <w:t>📱  텔레그램 (Telegram)</w:t>
             </w:r>
           </w:p>
         </w:tc>
@@ -5440,7 +5440,7 @@
                 <w:color w:val="404040"/>
                 <w:sz w:val="19"/>
               </w:rPr>
-              <w:t>전체 진행 컨설팅 및 외부 원격 지시</w:t>
+              <w:t>외부 원격 지시 채널</w:t>
             </w:r>
           </w:p>
         </w:tc>
@@ -5455,7 +5455,56 @@
                 <w:color w:val="404040"/>
                 <w:sz w:val="19"/>
               </w:rPr>
-              <w:t>텔레그램으로 외부에서 단계별 지시</w:t>
+              <w:t>개발자가 어디서든 텔레그램으로</w:t>
+              <w:br/>
+              <w:t>OpenClaw에 개발 지시 전달</w:t>
+            </w:r>
+          </w:p>
+        </w:tc>
+      </w:tr>
+      <w:tr>
+        <w:tc>
+          <w:tcPr>
+            <w:tcW w:type="dxa" w:w="3024"/>
+            <w:shd w:val="clear" w:color="auto" w:fill="FFFFFF"/>
+          </w:tcPr>
+          <w:p>
+            <w:r>
+              <w:rPr>
+                <w:color w:val="404040"/>
+                <w:sz w:val="19"/>
+              </w:rPr>
+              <w:t>🦅  OpenClaw 에이전트</w:t>
+            </w:r>
+          </w:p>
+        </w:tc>
+        <w:tc>
+          <w:tcPr>
+            <w:tcW w:type="dxa" w:w="3024"/>
+            <w:shd w:val="clear" w:color="auto" w:fill="FFFFFF"/>
+          </w:tcPr>
+          <w:p>
+            <w:r>
+              <w:rPr>
+                <w:color w:val="404040"/>
+                <w:sz w:val="19"/>
+              </w:rPr>
+              <w:t>전체 진행 컨설팅 및 원격 지시 해석</w:t>
+            </w:r>
+          </w:p>
+        </w:tc>
+        <w:tc>
+          <w:tcPr>
+            <w:tcW w:type="dxa" w:w="3024"/>
+            <w:shd w:val="clear" w:color="auto" w:fill="FFFFFF"/>
+          </w:tcPr>
+          <w:p>
+            <w:r>
+              <w:rPr>
+                <w:color w:val="404040"/>
+                <w:sz w:val="19"/>
+              </w:rPr>
+              <w:t>텔레그램 지시 수신 → 분석 → 단계별 실행 계획</w:t>
               <w:br/>
               <w:t>기획·아키텍처·테스트 전략 수립</w:t>
             </w:r>
@@ -5466,18 +5515,52 @@
         <w:tc>
           <w:tcPr>
             <w:tcW w:type="dxa" w:w="3024"/>
-            <w:shd w:val="clear" w:color="auto" w:fill="FFFFFF"/>
-          </w:tcPr>
-          <w:p>
-            <w:r>
-              <w:rPr>
-                <w:color w:val="404040"/>
-                <w:sz w:val="19"/>
-              </w:rPr>
-              <w:t>💻  VSCode</w:t>
-            </w:r>
-          </w:p>
-        </w:tc>
+            <w:shd w:val="clear" w:color="auto" w:fill="DEEBF7"/>
+          </w:tcPr>
+          <w:p>
+            <w:r>
+              <w:rPr>
+                <w:color w:val="404040"/>
+                <w:sz w:val="19"/>
+              </w:rPr>
+              <w:t>💻  VSCode + Claude Code</w:t>
+            </w:r>
+          </w:p>
+        </w:tc>
+        <w:tc>
+          <w:tcPr>
+            <w:tcW w:type="dxa" w:w="3024"/>
+            <w:shd w:val="clear" w:color="auto" w:fill="DEEBF7"/>
+          </w:tcPr>
+          <w:p>
+            <w:r>
+              <w:rPr>
+                <w:color w:val="404040"/>
+                <w:sz w:val="19"/>
+              </w:rPr>
+              <w:t>로컬 PC 코드 자동 생성 및 실행</w:t>
+            </w:r>
+          </w:p>
+        </w:tc>
+        <w:tc>
+          <w:tcPr>
+            <w:tcW w:type="dxa" w:w="3024"/>
+            <w:shd w:val="clear" w:color="auto" w:fill="DEEBF7"/>
+          </w:tcPr>
+          <w:p>
+            <w:r>
+              <w:rPr>
+                <w:color w:val="404040"/>
+                <w:sz w:val="19"/>
+              </w:rPr>
+              <w:t>자연어 지시 → 코드 자동 작성</w:t>
+              <w:br/>
+              <w:t>디버깅·리팩토링·테스트 지원</w:t>
+            </w:r>
+          </w:p>
+        </w:tc>
+      </w:tr>
+      <w:tr>
         <w:tc>
           <w:tcPr>
             <w:tcW w:type="dxa" w:w="3024"/>
@@ -5489,7 +5572,7 @@
                 <w:color w:val="404040"/>
                 <w:sz w:val="19"/>
               </w:rPr>
-              <w:t>코드 편집기·개발 환경</w:t>
+              <w:t>🐙  GitHub</w:t>
             </w:r>
           </w:p>
         </w:tc>
@@ -5504,9 +5587,734 @@
                 <w:color w:val="404040"/>
                 <w:sz w:val="19"/>
               </w:rPr>
-              <w:t>파일 편집, 터미널 실행,</w:t>
+              <w:t>소스코드 버전 관리 및 공유</w:t>
+            </w:r>
+          </w:p>
+        </w:tc>
+        <w:tc>
+          <w:tcPr>
+            <w:tcW w:type="dxa" w:w="3024"/>
+            <w:shd w:val="clear" w:color="auto" w:fill="FFFFFF"/>
+          </w:tcPr>
+          <w:p>
+            <w:r>
+              <w:rPr>
+                <w:color w:val="404040"/>
+                <w:sz w:val="19"/>
+              </w:rPr>
+              <w:t>Git 이력 관리 + 오픈소스 공개</w:t>
               <w:br/>
-              <w:t>프로젝트 구조 관리</w:t>
+              <w:t>팀 협업 및 코드 백업</w:t>
+            </w:r>
+          </w:p>
+        </w:tc>
+      </w:tr>
+    </w:tbl>
+    <w:p>
+      <w:pPr>
+        <w:spacing w:after="80"/>
+      </w:pPr>
+    </w:p>
+    <w:p>
+      <w:pPr>
+        <w:pStyle w:val="Heading2"/>
+        <w:spacing w:before="240" w:after="80"/>
+      </w:pPr>
+      <w:r>
+        <w:rPr>
+          <w:b/>
+          <w:color w:val="1164A3"/>
+          <w:sz w:val="28"/>
+        </w:rPr>
+        <w:t>📡  외부 원격 지시 흐름 도식: Telegram → OpenClaw → 로컬 시스템</w:t>
+      </w:r>
+    </w:p>
+    <w:p>
+      <w:pPr>
+        <w:spacing w:after="120"/>
+      </w:pPr>
+      <w:r>
+        <w:rPr>
+          <w:b w:val="0"/>
+          <w:color w:val="404040"/>
+          <w:sz w:val="21"/>
+        </w:rPr>
+        <w:t>보안 원칙상 외부에서 로컬 시스템에 직접 접근하지 않고, 텔레그램 → OpenClaw 에이전트 → Claude Code(로컬) 경로로만 개발 지시가 전달되었습니다.</w:t>
+      </w:r>
+    </w:p>
+    <w:tbl>
+      <w:tblPr>
+        <w:tblW w:type="auto" w:w="0"/>
+        <w:jc w:val="left"/>
+        <w:tblLook w:firstColumn="1" w:firstRow="1" w:lastColumn="0" w:lastRow="0" w:noHBand="0" w:noVBand="1" w:val="04A0"/>
+        <w:tblBorders>
+          <w:top w:val="single" w:sz="6" w:color="1164A3"/>
+          <w:left w:val="single" w:sz="6" w:color="1164A3"/>
+          <w:bottom w:val="single" w:sz="6" w:color="1164A3"/>
+          <w:right w:val="single" w:sz="6" w:color="1164A3"/>
+          <w:insideH w:val="single" w:sz="6" w:color="1164A3"/>
+          <w:insideV w:val="single" w:sz="6" w:color="1164A3"/>
+        </w:tblBorders>
+      </w:tblPr>
+      <w:tblGrid>
+        <w:gridCol w:w="4536"/>
+        <w:gridCol w:w="4536"/>
+      </w:tblGrid>
+      <w:tr>
+        <w:tc>
+          <w:tcPr>
+            <w:tcW w:type="dxa" w:w="794"/>
+            <w:shd w:val="clear" w:color="auto" w:fill="1E3A5F"/>
+          </w:tcPr>
+          <w:p>
+            <w:pPr>
+              <w:jc w:val="center"/>
+            </w:pPr>
+            <w:r>
+              <w:rPr>
+                <w:sz w:val="36"/>
+              </w:rPr>
+              <w:t>📱</w:t>
+            </w:r>
+          </w:p>
+        </w:tc>
+        <w:tc>
+          <w:tcPr>
+            <w:tcW w:type="dxa" w:w="4536"/>
+            <w:shd w:val="clear" w:color="auto" w:fill="6E8AAF"/>
+          </w:tcPr>
+          <w:p>
+            <w:r>
+              <w:rPr>
+                <w:b/>
+                <w:color w:val="FFFFFF"/>
+                <w:sz w:val="21"/>
+              </w:rPr>
+              <w:t>외부 환경 (개발자·관리자)</w:t>
+            </w:r>
+          </w:p>
+          <w:p>
+            <w:r>
+              <w:rPr>
+                <w:color w:val="DDDDDD"/>
+                <w:sz w:val="18"/>
+              </w:rPr>
+              <w:t>외부 어디서든 스마트폰·PC로 접속 가능</w:t>
+            </w:r>
+          </w:p>
+        </w:tc>
+      </w:tr>
+    </w:tbl>
+    <w:p>
+      <w:pPr>
+        <w:spacing w:after="0"/>
+      </w:pPr>
+    </w:p>
+    <w:p>
+      <w:pPr>
+        <w:spacing w:before="0" w:after="0"/>
+        <w:jc w:val="center"/>
+      </w:pPr>
+      <w:r>
+        <w:rPr>
+          <w:color w:val="1164A3"/>
+          <w:sz w:val="28"/>
+        </w:rPr>
+        <w:t>▼</w:t>
+      </w:r>
+    </w:p>
+    <w:tbl>
+      <w:tblPr>
+        <w:tblW w:type="auto" w:w="0"/>
+        <w:jc w:val="left"/>
+        <w:tblLook w:firstColumn="1" w:firstRow="1" w:lastColumn="0" w:lastRow="0" w:noHBand="0" w:noVBand="1" w:val="04A0"/>
+        <w:tblBorders>
+          <w:top w:val="single" w:sz="6" w:color="1164A3"/>
+          <w:left w:val="single" w:sz="6" w:color="1164A3"/>
+          <w:bottom w:val="single" w:sz="6" w:color="1164A3"/>
+          <w:right w:val="single" w:sz="6" w:color="1164A3"/>
+          <w:insideH w:val="single" w:sz="6" w:color="1164A3"/>
+          <w:insideV w:val="single" w:sz="6" w:color="1164A3"/>
+        </w:tblBorders>
+      </w:tblPr>
+      <w:tblGrid>
+        <w:gridCol w:w="4536"/>
+        <w:gridCol w:w="4536"/>
+      </w:tblGrid>
+      <w:tr>
+        <w:tc>
+          <w:tcPr>
+            <w:tcW w:type="dxa" w:w="794"/>
+            <w:shd w:val="clear" w:color="auto" w:fill="17528A"/>
+          </w:tcPr>
+          <w:p>
+            <w:pPr>
+              <w:jc w:val="center"/>
+            </w:pPr>
+            <w:r>
+              <w:rPr>
+                <w:sz w:val="36"/>
+              </w:rPr>
+              <w:t>🦅</w:t>
+            </w:r>
+          </w:p>
+        </w:tc>
+        <w:tc>
+          <w:tcPr>
+            <w:tcW w:type="dxa" w:w="4536"/>
+            <w:shd w:val="clear" w:color="auto" w:fill="67A2DA"/>
+          </w:tcPr>
+          <w:p>
+            <w:r>
+              <w:rPr>
+                <w:b/>
+                <w:color w:val="FFFFFF"/>
+                <w:sz w:val="21"/>
+              </w:rPr>
+              <w:t>텔레그램 → OpenClaw 에이전트</w:t>
+            </w:r>
+          </w:p>
+          <w:p>
+            <w:r>
+              <w:rPr>
+                <w:color w:val="DDDDDD"/>
+                <w:sz w:val="18"/>
+              </w:rPr>
+              <w:t>"2단계: 파서 구현해줘. PDF·TXT·DOCX·PPTX 지원" 등 자연어 지시</w:t>
+            </w:r>
+          </w:p>
+        </w:tc>
+      </w:tr>
+    </w:tbl>
+    <w:p>
+      <w:pPr>
+        <w:spacing w:after="0"/>
+      </w:pPr>
+    </w:p>
+    <w:p>
+      <w:pPr>
+        <w:spacing w:before="0" w:after="0"/>
+        <w:jc w:val="center"/>
+      </w:pPr>
+      <w:r>
+        <w:rPr>
+          <w:color w:val="1164A3"/>
+          <w:sz w:val="28"/>
+        </w:rPr>
+        <w:t>▼</w:t>
+      </w:r>
+    </w:p>
+    <w:tbl>
+      <w:tblPr>
+        <w:tblW w:type="auto" w:w="0"/>
+        <w:jc w:val="left"/>
+        <w:tblLook w:firstColumn="1" w:firstRow="1" w:lastColumn="0" w:lastRow="0" w:noHBand="0" w:noVBand="1" w:val="04A0"/>
+        <w:tblBorders>
+          <w:top w:val="single" w:sz="6" w:color="1164A3"/>
+          <w:left w:val="single" w:sz="6" w:color="1164A3"/>
+          <w:bottom w:val="single" w:sz="6" w:color="1164A3"/>
+          <w:right w:val="single" w:sz="6" w:color="1164A3"/>
+          <w:insideH w:val="single" w:sz="6" w:color="1164A3"/>
+          <w:insideV w:val="single" w:sz="6" w:color="1164A3"/>
+        </w:tblBorders>
+      </w:tblPr>
+      <w:tblGrid>
+        <w:gridCol w:w="4536"/>
+        <w:gridCol w:w="4536"/>
+      </w:tblGrid>
+      <w:tr>
+        <w:tc>
+          <w:tcPr>
+            <w:tcW w:type="dxa" w:w="794"/>
+            <w:shd w:val="clear" w:color="auto" w:fill="1F6E43"/>
+          </w:tcPr>
+          <w:p>
+            <w:pPr>
+              <w:jc w:val="center"/>
+            </w:pPr>
+            <w:r>
+              <w:rPr>
+                <w:sz w:val="36"/>
+              </w:rPr>
+              <w:t>🤖</w:t>
+            </w:r>
+          </w:p>
+        </w:tc>
+        <w:tc>
+          <w:tcPr>
+            <w:tcW w:type="dxa" w:w="4536"/>
+            <w:shd w:val="clear" w:color="auto" w:fill="6FBE93"/>
+          </w:tcPr>
+          <w:p>
+            <w:r>
+              <w:rPr>
+                <w:b/>
+                <w:color w:val="FFFFFF"/>
+                <w:sz w:val="21"/>
+              </w:rPr>
+              <w:t>Claude Code  (VSCode + 로컬 PC)</w:t>
+            </w:r>
+          </w:p>
+          <w:p>
+            <w:r>
+              <w:rPr>
+                <w:color w:val="DDDDDD"/>
+                <w:sz w:val="18"/>
+              </w:rPr>
+              <w:t>자연어 지시를 코드로 변환 · 자동 실행 · 오류 수정</w:t>
+            </w:r>
+          </w:p>
+        </w:tc>
+      </w:tr>
+    </w:tbl>
+    <w:p>
+      <w:pPr>
+        <w:spacing w:after="0"/>
+      </w:pPr>
+    </w:p>
+    <w:p>
+      <w:pPr>
+        <w:spacing w:before="0" w:after="0"/>
+        <w:jc w:val="center"/>
+      </w:pPr>
+      <w:r>
+        <w:rPr>
+          <w:color w:val="1164A3"/>
+          <w:sz w:val="28"/>
+        </w:rPr>
+        <w:t>▼</w:t>
+      </w:r>
+    </w:p>
+    <w:tbl>
+      <w:tblPr>
+        <w:tblW w:type="auto" w:w="0"/>
+        <w:jc w:val="left"/>
+        <w:tblLook w:firstColumn="1" w:firstRow="1" w:lastColumn="0" w:lastRow="0" w:noHBand="0" w:noVBand="1" w:val="04A0"/>
+        <w:tblBorders>
+          <w:top w:val="single" w:sz="6" w:color="1164A3"/>
+          <w:left w:val="single" w:sz="6" w:color="1164A3"/>
+          <w:bottom w:val="single" w:sz="6" w:color="1164A3"/>
+          <w:right w:val="single" w:sz="6" w:color="1164A3"/>
+          <w:insideH w:val="single" w:sz="6" w:color="1164A3"/>
+          <w:insideV w:val="single" w:sz="6" w:color="1164A3"/>
+        </w:tblBorders>
+      </w:tblPr>
+      <w:tblGrid>
+        <w:gridCol w:w="4536"/>
+        <w:gridCol w:w="4536"/>
+      </w:tblGrid>
+      <w:tr>
+        <w:tc>
+          <w:tcPr>
+            <w:tcW w:type="dxa" w:w="794"/>
+            <w:shd w:val="clear" w:color="auto" w:fill="404070"/>
+          </w:tcPr>
+          <w:p>
+            <w:pPr>
+              <w:jc w:val="center"/>
+            </w:pPr>
+            <w:r>
+              <w:rPr>
+                <w:sz w:val="36"/>
+              </w:rPr>
+              <w:t>🏠</w:t>
+            </w:r>
+          </w:p>
+        </w:tc>
+        <w:tc>
+          <w:tcPr>
+            <w:tcW w:type="dxa" w:w="4536"/>
+            <w:shd w:val="clear" w:color="auto" w:fill="9090C0"/>
+          </w:tcPr>
+          <w:p>
+            <w:r>
+              <w:rPr>
+                <w:b/>
+                <w:color w:val="FFFFFF"/>
+                <w:sz w:val="21"/>
+              </w:rPr>
+              <w:t>로컬 RAG 챗봇 시스템</w:t>
+            </w:r>
+          </w:p>
+          <w:p>
+            <w:r>
+              <w:rPr>
+                <w:color w:val="DDDDDD"/>
+                <w:sz w:val="18"/>
+              </w:rPr>
+              <w:t>Streamlit UI + Ollama LLM + Chroma DB  ← 모두 로컬(인터넷 없음)</w:t>
+            </w:r>
+          </w:p>
+        </w:tc>
+      </w:tr>
+    </w:tbl>
+    <w:p>
+      <w:pPr>
+        <w:spacing w:after="0"/>
+      </w:pPr>
+    </w:p>
+    <w:p>
+      <w:pPr>
+        <w:spacing w:before="0" w:after="0"/>
+        <w:jc w:val="center"/>
+      </w:pPr>
+      <w:r>
+        <w:rPr>
+          <w:color w:val="1164A3"/>
+          <w:sz w:val="28"/>
+        </w:rPr>
+        <w:t>▼</w:t>
+      </w:r>
+    </w:p>
+    <w:tbl>
+      <w:tblPr>
+        <w:tblW w:type="auto" w:w="0"/>
+        <w:jc w:val="left"/>
+        <w:tblLook w:firstColumn="1" w:firstRow="1" w:lastColumn="0" w:lastRow="0" w:noHBand="0" w:noVBand="1" w:val="04A0"/>
+        <w:tblBorders>
+          <w:top w:val="single" w:sz="6" w:color="1164A3"/>
+          <w:left w:val="single" w:sz="6" w:color="1164A3"/>
+          <w:bottom w:val="single" w:sz="6" w:color="1164A3"/>
+          <w:right w:val="single" w:sz="6" w:color="1164A3"/>
+          <w:insideH w:val="single" w:sz="6" w:color="1164A3"/>
+          <w:insideV w:val="single" w:sz="6" w:color="1164A3"/>
+        </w:tblBorders>
+      </w:tblPr>
+      <w:tblGrid>
+        <w:gridCol w:w="4536"/>
+        <w:gridCol w:w="4536"/>
+      </w:tblGrid>
+      <w:tr>
+        <w:tc>
+          <w:tcPr>
+            <w:tcW w:type="dxa" w:w="794"/>
+            <w:shd w:val="clear" w:color="auto" w:fill="17528A"/>
+          </w:tcPr>
+          <w:p>
+            <w:pPr>
+              <w:jc w:val="center"/>
+            </w:pPr>
+            <w:r>
+              <w:rPr>
+                <w:sz w:val="36"/>
+              </w:rPr>
+              <w:t>🦅</w:t>
+            </w:r>
+          </w:p>
+        </w:tc>
+        <w:tc>
+          <w:tcPr>
+            <w:tcW w:type="dxa" w:w="4536"/>
+            <w:shd w:val="clear" w:color="auto" w:fill="67A2DA"/>
+          </w:tcPr>
+          <w:p>
+            <w:r>
+              <w:rPr>
+                <w:b/>
+                <w:color w:val="FFFFFF"/>
+                <w:sz w:val="21"/>
+              </w:rPr>
+              <w:t>OpenClaw 에이전트 → 텔레그램 보고</w:t>
+            </w:r>
+          </w:p>
+          <w:p>
+            <w:r>
+              <w:rPr>
+                <w:color w:val="DDDDDD"/>
+                <w:sz w:val="18"/>
+              </w:rPr>
+              <w:t>"파서 완료. 30/30 성공. 다음 단계 진행하시겠습니까?"</w:t>
+            </w:r>
+          </w:p>
+        </w:tc>
+      </w:tr>
+    </w:tbl>
+    <w:p>
+      <w:pPr>
+        <w:spacing w:after="0"/>
+      </w:pPr>
+    </w:p>
+    <w:p>
+      <w:pPr>
+        <w:spacing w:before="0" w:after="0"/>
+        <w:jc w:val="center"/>
+      </w:pPr>
+      <w:r>
+        <w:rPr>
+          <w:color w:val="1164A3"/>
+          <w:sz w:val="28"/>
+        </w:rPr>
+        <w:t>▼</w:t>
+      </w:r>
+    </w:p>
+    <w:tbl>
+      <w:tblPr>
+        <w:tblW w:type="auto" w:w="0"/>
+        <w:jc w:val="left"/>
+        <w:tblLook w:firstColumn="1" w:firstRow="1" w:lastColumn="0" w:lastRow="0" w:noHBand="0" w:noVBand="1" w:val="04A0"/>
+        <w:tblBorders>
+          <w:top w:val="single" w:sz="6" w:color="1164A3"/>
+          <w:left w:val="single" w:sz="6" w:color="1164A3"/>
+          <w:bottom w:val="single" w:sz="6" w:color="1164A3"/>
+          <w:right w:val="single" w:sz="6" w:color="1164A3"/>
+          <w:insideH w:val="single" w:sz="6" w:color="1164A3"/>
+          <w:insideV w:val="single" w:sz="6" w:color="1164A3"/>
+        </w:tblBorders>
+      </w:tblPr>
+      <w:tblGrid>
+        <w:gridCol w:w="4536"/>
+        <w:gridCol w:w="4536"/>
+      </w:tblGrid>
+      <w:tr>
+        <w:tc>
+          <w:tcPr>
+            <w:tcW w:type="dxa" w:w="794"/>
+            <w:shd w:val="clear" w:color="auto" w:fill="1E3A5F"/>
+          </w:tcPr>
+          <w:p>
+            <w:pPr>
+              <w:jc w:val="center"/>
+            </w:pPr>
+            <w:r>
+              <w:rPr>
+                <w:sz w:val="36"/>
+              </w:rPr>
+              <w:t>📱</w:t>
+            </w:r>
+          </w:p>
+        </w:tc>
+        <w:tc>
+          <w:tcPr>
+            <w:tcW w:type="dxa" w:w="4536"/>
+            <w:shd w:val="clear" w:color="auto" w:fill="6E8AAF"/>
+          </w:tcPr>
+          <w:p>
+            <w:r>
+              <w:rPr>
+                <w:b/>
+                <w:color w:val="FFFFFF"/>
+                <w:sz w:val="21"/>
+              </w:rPr>
+              <w:t>외부 환경 (개발자·관리자)</w:t>
+            </w:r>
+          </w:p>
+          <w:p>
+            <w:r>
+              <w:rPr>
+                <w:color w:val="DDDDDD"/>
+                <w:sz w:val="18"/>
+              </w:rPr>
+              <w:t>결과 확인 후 다음 단계 지시</w:t>
+            </w:r>
+          </w:p>
+        </w:tc>
+      </w:tr>
+    </w:tbl>
+    <w:p>
+      <w:pPr>
+        <w:spacing w:after="0"/>
+      </w:pPr>
+    </w:p>
+    <w:p>
+      <w:pPr>
+        <w:spacing w:after="120"/>
+      </w:pPr>
+    </w:p>
+    <w:tbl>
+      <w:tblPr>
+        <w:tblW w:type="auto" w:w="0"/>
+        <w:jc w:val="left"/>
+        <w:tblLook w:firstColumn="1" w:firstRow="1" w:lastColumn="0" w:lastRow="0" w:noHBand="0" w:noVBand="1" w:val="04A0"/>
+        <w:tblBorders>
+          <w:top w:val="single" w:sz="8" w:color="1F6E43"/>
+          <w:left w:val="single" w:sz="8" w:color="1F6E43"/>
+          <w:bottom w:val="single" w:sz="8" w:color="1F6E43"/>
+          <w:right w:val="single" w:sz="8" w:color="1F6E43"/>
+          <w:insideH w:val="single" w:sz="8" w:color="1F6E43"/>
+          <w:insideV w:val="single" w:sz="8" w:color="1F6E43"/>
+        </w:tblBorders>
+      </w:tblPr>
+      <w:tblGrid>
+        <w:gridCol w:w="9072"/>
+      </w:tblGrid>
+      <w:tr>
+        <w:tc>
+          <w:tcPr>
+            <w:tcW w:type="dxa" w:w="9071"/>
+            <w:shd w:val="clear" w:color="auto" w:fill="E2EFDA"/>
+          </w:tcPr>
+          <w:p>
+            <w:pPr>
+              <w:spacing w:before="40" w:after="40"/>
+            </w:pPr>
+            <w:r>
+              <w:rPr>
+                <w:sz w:val="20"/>
+              </w:rPr>
+              <w:t>🔐  보안 포인트</w:t>
+            </w:r>
+          </w:p>
+          <w:p>
+            <w:pPr>
+              <w:spacing w:before="40" w:after="40"/>
+            </w:pPr>
+            <w:r>
+              <w:rPr>
+                <w:sz w:val="20"/>
+              </w:rPr>
+            </w:r>
+          </w:p>
+          <w:p>
+            <w:pPr>
+              <w:spacing w:before="40" w:after="40"/>
+            </w:pPr>
+            <w:r>
+              <w:rPr>
+                <w:sz w:val="20"/>
+              </w:rPr>
+              <w:t xml:space="preserve">  • 텔레그램은 지시 전달 채널일 뿐 — 회사 문서나 RAG 처리 결과는 텔레그램을 통해</w:t>
+            </w:r>
+          </w:p>
+          <w:p>
+            <w:pPr>
+              <w:spacing w:before="40" w:after="40"/>
+            </w:pPr>
+            <w:r>
+              <w:rPr>
+                <w:sz w:val="20"/>
+              </w:rPr>
+              <w:t xml:space="preserve">    오가지 않습니다.</w:t>
+            </w:r>
+          </w:p>
+          <w:p>
+            <w:pPr>
+              <w:spacing w:before="40" w:after="40"/>
+            </w:pPr>
+            <w:r>
+              <w:rPr>
+                <w:sz w:val="20"/>
+              </w:rPr>
+              <w:t xml:space="preserve">  • 로컬 RAG 시스템은 항상 내부망에서만 동작하며,</w:t>
+            </w:r>
+          </w:p>
+          <w:p>
+            <w:pPr>
+              <w:spacing w:before="40" w:after="40"/>
+            </w:pPr>
+            <w:r>
+              <w:rPr>
+                <w:sz w:val="20"/>
+              </w:rPr>
+              <w:t xml:space="preserve">    외부에서 직접 접근하는 포트나 URL은 존재하지 않습니다.</w:t>
+            </w:r>
+          </w:p>
+          <w:p>
+            <w:pPr>
+              <w:spacing w:before="40" w:after="40"/>
+            </w:pPr>
+            <w:r>
+              <w:rPr>
+                <w:sz w:val="20"/>
+              </w:rPr>
+              <w:t xml:space="preserve">  • OpenClaw 에이전트가 전달하는 것은 '개발 지시(텍스트)'뿐입니다.</w:t>
+            </w:r>
+          </w:p>
+        </w:tc>
+      </w:tr>
+    </w:tbl>
+    <w:p>
+      <w:pPr>
+        <w:spacing w:after="80"/>
+      </w:pPr>
+    </w:p>
+    <w:p>
+      <w:pPr>
+        <w:pStyle w:val="Heading2"/>
+        <w:spacing w:before="240" w:after="80"/>
+      </w:pPr>
+      <w:r>
+        <w:rPr>
+          <w:b/>
+          <w:color w:val="1164A3"/>
+          <w:sz w:val="28"/>
+        </w:rPr>
+        <w:t>📋  OpenClaw 원격 지시 — 단계별 예시</w:t>
+      </w:r>
+    </w:p>
+    <w:tbl>
+      <w:tblPr>
+        <w:tblW w:type="auto" w:w="0"/>
+        <w:jc w:val="left"/>
+        <w:tblLook w:firstColumn="1" w:firstRow="1" w:lastColumn="0" w:lastRow="0" w:noHBand="0" w:noVBand="1" w:val="04A0"/>
+        <w:tblBorders>
+          <w:top w:val="single" w:sz="6" w:color="1164A3"/>
+          <w:left w:val="single" w:sz="6" w:color="1164A3"/>
+          <w:bottom w:val="single" w:sz="6" w:color="1164A3"/>
+          <w:right w:val="single" w:sz="6" w:color="1164A3"/>
+          <w:insideH w:val="single" w:sz="6" w:color="1164A3"/>
+          <w:insideV w:val="single" w:sz="6" w:color="1164A3"/>
+        </w:tblBorders>
+      </w:tblPr>
+      <w:tblGrid>
+        <w:gridCol w:w="3024"/>
+        <w:gridCol w:w="3024"/>
+        <w:gridCol w:w="3024"/>
+      </w:tblGrid>
+      <w:tr>
+        <w:tc>
+          <w:tcPr>
+            <w:tcW w:type="dxa" w:w="3024"/>
+            <w:shd w:val="clear" w:color="auto" w:fill="1E3A5F"/>
+          </w:tcPr>
+          <w:p>
+            <w:pPr>
+              <w:jc w:val="center"/>
+            </w:pPr>
+            <w:r>
+              <w:rPr>
+                <w:b/>
+                <w:color w:val="FFFFFF"/>
+                <w:sz w:val="20"/>
+              </w:rPr>
+              <w:t>단계</w:t>
+            </w:r>
+          </w:p>
+        </w:tc>
+        <w:tc>
+          <w:tcPr>
+            <w:tcW w:type="dxa" w:w="3024"/>
+            <w:shd w:val="clear" w:color="auto" w:fill="1E3A5F"/>
+          </w:tcPr>
+          <w:p>
+            <w:pPr>
+              <w:jc w:val="center"/>
+            </w:pPr>
+            <w:r>
+              <w:rPr>
+                <w:b/>
+                <w:color w:val="FFFFFF"/>
+                <w:sz w:val="20"/>
+              </w:rPr>
+              <w:t>위치</w:t>
+            </w:r>
+          </w:p>
+        </w:tc>
+        <w:tc>
+          <w:tcPr>
+            <w:tcW w:type="dxa" w:w="3024"/>
+            <w:shd w:val="clear" w:color="auto" w:fill="1E3A5F"/>
+          </w:tcPr>
+          <w:p>
+            <w:pPr>
+              <w:jc w:val="center"/>
+            </w:pPr>
+            <w:r>
+              <w:rPr>
+                <w:b/>
+                <w:color w:val="FFFFFF"/>
+                <w:sz w:val="20"/>
+              </w:rPr>
+              <w:t>실제 내용</w:t>
             </w:r>
           </w:p>
         </w:tc>
@@ -5523,7 +6331,7 @@
                 <w:color w:val="404040"/>
                 <w:sz w:val="19"/>
               </w:rPr>
-              <w:t>🤖  Codex / Claude Code</w:t>
+              <w:t>1. 지시 전달</w:t>
             </w:r>
           </w:p>
         </w:tc>
@@ -5538,7 +6346,7 @@
                 <w:color w:val="404040"/>
                 <w:sz w:val="19"/>
               </w:rPr>
-              <w:t>실제 코드 자동 생성</w:t>
+              <w:t>외부 → 텔레그램 → OpenClaw</w:t>
             </w:r>
           </w:p>
         </w:tc>
@@ -5553,9 +6361,7 @@
                 <w:color w:val="404040"/>
                 <w:sz w:val="19"/>
               </w:rPr>
-              <w:t>자연어 지시 → 코드 자동 작성</w:t>
-              <w:br/>
-              <w:t>디버깅·리팩토링 지원</w:t>
+              <w:t>"2단계: 파서 구현. PDF·TXT·DOCX·PPTX 지원, 카테고리 자동 감지"</w:t>
             </w:r>
           </w:p>
         </w:tc>
@@ -5572,7 +6378,7 @@
                 <w:color w:val="404040"/>
                 <w:sz w:val="19"/>
               </w:rPr>
-              <w:t>🌐  Vercel</w:t>
+              <w:t>2. 계획 수립</w:t>
             </w:r>
           </w:p>
         </w:tc>
@@ -5587,7 +6393,7 @@
                 <w:color w:val="404040"/>
                 <w:sz w:val="19"/>
               </w:rPr>
-              <w:t>데모 배포 및 URL 공유</w:t>
+              <w:t>OpenClaw 에이전트</w:t>
             </w:r>
           </w:p>
         </w:tc>
@@ -5602,9 +6408,148 @@
                 <w:color w:val="404040"/>
                 <w:sz w:val="19"/>
               </w:rPr>
-              <w:t>GitHub 연동 → 자동 빌드</w:t>
-              <w:br/>
-              <w:t>데모용 공개 URL 제공</w:t>
+              <w:t>요구사항 정리 → 파일 구조 설계 → Claude Code에 구현 지시</w:t>
+            </w:r>
+          </w:p>
+        </w:tc>
+      </w:tr>
+      <w:tr>
+        <w:tc>
+          <w:tcPr>
+            <w:tcW w:type="dxa" w:w="3024"/>
+            <w:shd w:val="clear" w:color="auto" w:fill="DEEBF7"/>
+          </w:tcPr>
+          <w:p>
+            <w:r>
+              <w:rPr>
+                <w:color w:val="404040"/>
+                <w:sz w:val="19"/>
+              </w:rPr>
+              <w:t>3. 코드 생성</w:t>
+            </w:r>
+          </w:p>
+        </w:tc>
+        <w:tc>
+          <w:tcPr>
+            <w:tcW w:type="dxa" w:w="3024"/>
+            <w:shd w:val="clear" w:color="auto" w:fill="DEEBF7"/>
+          </w:tcPr>
+          <w:p>
+            <w:r>
+              <w:rPr>
+                <w:color w:val="404040"/>
+                <w:sz w:val="19"/>
+              </w:rPr>
+              <w:t>Claude Code (로컬 PC)</w:t>
+            </w:r>
+          </w:p>
+        </w:tc>
+        <w:tc>
+          <w:tcPr>
+            <w:tcW w:type="dxa" w:w="3024"/>
+            <w:shd w:val="clear" w:color="auto" w:fill="DEEBF7"/>
+          </w:tcPr>
+          <w:p>
+            <w:r>
+              <w:rPr>
+                <w:color w:val="404040"/>
+                <w:sz w:val="19"/>
+              </w:rPr>
+              <w:t>src/parsers.py 자동 생성 → 30개 파일 테스트 실행</w:t>
+            </w:r>
+          </w:p>
+        </w:tc>
+      </w:tr>
+      <w:tr>
+        <w:tc>
+          <w:tcPr>
+            <w:tcW w:type="dxa" w:w="3024"/>
+            <w:shd w:val="clear" w:color="auto" w:fill="FFFFFF"/>
+          </w:tcPr>
+          <w:p>
+            <w:r>
+              <w:rPr>
+                <w:color w:val="404040"/>
+                <w:sz w:val="19"/>
+              </w:rPr>
+              <w:t>4. 결과 보고</w:t>
+            </w:r>
+          </w:p>
+        </w:tc>
+        <w:tc>
+          <w:tcPr>
+            <w:tcW w:type="dxa" w:w="3024"/>
+            <w:shd w:val="clear" w:color="auto" w:fill="FFFFFF"/>
+          </w:tcPr>
+          <w:p>
+            <w:r>
+              <w:rPr>
+                <w:color w:val="404040"/>
+                <w:sz w:val="19"/>
+              </w:rPr>
+              <w:t>Claude Code → OpenClaw → 텔레그램</w:t>
+            </w:r>
+          </w:p>
+        </w:tc>
+        <w:tc>
+          <w:tcPr>
+            <w:tcW w:type="dxa" w:w="3024"/>
+            <w:shd w:val="clear" w:color="auto" w:fill="FFFFFF"/>
+          </w:tcPr>
+          <w:p>
+            <w:r>
+              <w:rPr>
+                <w:color w:val="404040"/>
+                <w:sz w:val="19"/>
+              </w:rPr>
+              <w:t>"파서 완료. 30/30 성공. 오류 0건. 3단계 진행 가능"</w:t>
+            </w:r>
+          </w:p>
+        </w:tc>
+      </w:tr>
+      <w:tr>
+        <w:tc>
+          <w:tcPr>
+            <w:tcW w:type="dxa" w:w="3024"/>
+            <w:shd w:val="clear" w:color="auto" w:fill="DEEBF7"/>
+          </w:tcPr>
+          <w:p>
+            <w:r>
+              <w:rPr>
+                <w:color w:val="404040"/>
+                <w:sz w:val="19"/>
+              </w:rPr>
+              <w:t>5. 다음 지시</w:t>
+            </w:r>
+          </w:p>
+        </w:tc>
+        <w:tc>
+          <w:tcPr>
+            <w:tcW w:type="dxa" w:w="3024"/>
+            <w:shd w:val="clear" w:color="auto" w:fill="DEEBF7"/>
+          </w:tcPr>
+          <w:p>
+            <w:r>
+              <w:rPr>
+                <w:color w:val="404040"/>
+                <w:sz w:val="19"/>
+              </w:rPr>
+              <w:t>외부 → 텔레그램 → OpenClaw</w:t>
+            </w:r>
+          </w:p>
+        </w:tc>
+        <w:tc>
+          <w:tcPr>
+            <w:tcW w:type="dxa" w:w="3024"/>
+            <w:shd w:val="clear" w:color="auto" w:fill="DEEBF7"/>
+          </w:tcPr>
+          <w:p>
+            <w:r>
+              <w:rPr>
+                <w:color w:val="404040"/>
+                <w:sz w:val="19"/>
+              </w:rPr>
+              <w:t>"3단계 진행. 청킹 1600자·겹침 250자 기준으로"</w:t>
             </w:r>
           </w:p>
         </w:tc>
@@ -5714,7 +6659,7 @@
               <w:rPr>
                 <w:sz w:val="20"/>
               </w:rPr>
-              <w:t xml:space="preserve">  AI(Codex·Claude Code)가 코드를 대신 작성</w:t>
+              <w:t xml:space="preserve">  AI(Claude Code)가 코드를 대신 작성</w:t>
             </w:r>
           </w:p>
           <w:p>
@@ -5735,7 +6680,7 @@
               <w:rPr>
                 <w:sz w:val="20"/>
               </w:rPr>
-              <w:t xml:space="preserve">  👨‍💼 사람 (감독자·기획자)</w:t>
+              <w:t xml:space="preserve">  👨‍💼 사람 (감독자·기획자, 텔레그램으로 지시)</w:t>
             </w:r>
           </w:p>
           <w:p>
@@ -5757,7 +6702,7 @@
               <w:rPr>
                 <w:sz w:val="20"/>
               </w:rPr>
-              <w:t xml:space="preserve">         ↓ 지시</w:t>
+              <w:t xml:space="preserve">         ↓  OpenClaw 에이전트가 해석·전달</w:t>
             </w:r>
           </w:p>
           <w:p>
@@ -5768,7 +6713,7 @@
               <w:rPr>
                 <w:sz w:val="20"/>
               </w:rPr>
-              <w:t xml:space="preserve">  🤖 AI (Codex / Claude Code)</w:t>
+              <w:t xml:space="preserve">  🤖 Claude Code (로컬 PC에서 실행)</w:t>
             </w:r>
           </w:p>
           <w:p>
@@ -5801,7 +6746,7 @@
               <w:rPr>
                 <w:sz w:val="20"/>
               </w:rPr>
-              <w:t xml:space="preserve">      → 버그 자동 수정</w:t>
+              <w:t xml:space="preserve">      → 버그 자동 수정 후 보고</w:t>
             </w:r>
           </w:p>
           <w:p>
@@ -5823,292 +6768,6 @@
                 <w:sz w:val="20"/>
               </w:rPr>
               <w:t>마치 건축가가 설계도를 그리면 시공팀이 건물을 짓는 것과 같습니다.</w:t>
-            </w:r>
-          </w:p>
-        </w:tc>
-      </w:tr>
-    </w:tbl>
-    <w:p>
-      <w:pPr>
-        <w:spacing w:after="80"/>
-      </w:pPr>
-    </w:p>
-    <w:p>
-      <w:pPr>
-        <w:pStyle w:val="Heading2"/>
-        <w:spacing w:before="240" w:after="80"/>
-      </w:pPr>
-      <w:r>
-        <w:rPr>
-          <w:b/>
-          <w:color w:val="1164A3"/>
-          <w:sz w:val="28"/>
-        </w:rPr>
-        <w:t>📱  OpenClaw 원격 지시 흐름</w:t>
-      </w:r>
-    </w:p>
-    <w:tbl>
-      <w:tblPr>
-        <w:tblW w:type="auto" w:w="0"/>
-        <w:jc w:val="left"/>
-        <w:tblLook w:firstColumn="1" w:firstRow="1" w:lastColumn="0" w:lastRow="0" w:noHBand="0" w:noVBand="1" w:val="04A0"/>
-        <w:tblBorders>
-          <w:top w:val="single" w:sz="6" w:color="1164A3"/>
-          <w:left w:val="single" w:sz="6" w:color="1164A3"/>
-          <w:bottom w:val="single" w:sz="6" w:color="1164A3"/>
-          <w:right w:val="single" w:sz="6" w:color="1164A3"/>
-          <w:insideH w:val="single" w:sz="6" w:color="1164A3"/>
-          <w:insideV w:val="single" w:sz="6" w:color="1164A3"/>
-        </w:tblBorders>
-      </w:tblPr>
-      <w:tblGrid>
-        <w:gridCol w:w="3024"/>
-        <w:gridCol w:w="3024"/>
-        <w:gridCol w:w="3024"/>
-      </w:tblGrid>
-      <w:tr>
-        <w:tc>
-          <w:tcPr>
-            <w:tcW w:type="dxa" w:w="3024"/>
-            <w:shd w:val="clear" w:color="auto" w:fill="1E3A5F"/>
-          </w:tcPr>
-          <w:p>
-            <w:pPr>
-              <w:jc w:val="center"/>
-            </w:pPr>
-            <w:r>
-              <w:rPr>
-                <w:b/>
-                <w:color w:val="FFFFFF"/>
-                <w:sz w:val="20"/>
-              </w:rPr>
-              <w:t>단계</w:t>
-            </w:r>
-          </w:p>
-        </w:tc>
-        <w:tc>
-          <w:tcPr>
-            <w:tcW w:type="dxa" w:w="3024"/>
-            <w:shd w:val="clear" w:color="auto" w:fill="1E3A5F"/>
-          </w:tcPr>
-          <w:p>
-            <w:pPr>
-              <w:jc w:val="center"/>
-            </w:pPr>
-            <w:r>
-              <w:rPr>
-                <w:b/>
-                <w:color w:val="FFFFFF"/>
-                <w:sz w:val="20"/>
-              </w:rPr>
-              <w:t>위치</w:t>
-            </w:r>
-          </w:p>
-        </w:tc>
-        <w:tc>
-          <w:tcPr>
-            <w:tcW w:type="dxa" w:w="3024"/>
-            <w:shd w:val="clear" w:color="auto" w:fill="1E3A5F"/>
-          </w:tcPr>
-          <w:p>
-            <w:pPr>
-              <w:jc w:val="center"/>
-            </w:pPr>
-            <w:r>
-              <w:rPr>
-                <w:b/>
-                <w:color w:val="FFFFFF"/>
-                <w:sz w:val="20"/>
-              </w:rPr>
-              <w:t>내용</w:t>
-            </w:r>
-          </w:p>
-        </w:tc>
-      </w:tr>
-      <w:tr>
-        <w:tc>
-          <w:tcPr>
-            <w:tcW w:type="dxa" w:w="3024"/>
-            <w:shd w:val="clear" w:color="auto" w:fill="DEEBF7"/>
-          </w:tcPr>
-          <w:p>
-            <w:r>
-              <w:rPr>
-                <w:color w:val="404040"/>
-                <w:sz w:val="19"/>
-              </w:rPr>
-              <w:t>1. 지시</w:t>
-            </w:r>
-          </w:p>
-        </w:tc>
-        <w:tc>
-          <w:tcPr>
-            <w:tcW w:type="dxa" w:w="3024"/>
-            <w:shd w:val="clear" w:color="auto" w:fill="DEEBF7"/>
-          </w:tcPr>
-          <w:p>
-            <w:r>
-              <w:rPr>
-                <w:color w:val="404040"/>
-                <w:sz w:val="19"/>
-              </w:rPr>
-              <w:t>외부 (텔레그램)</w:t>
-            </w:r>
-          </w:p>
-        </w:tc>
-        <w:tc>
-          <w:tcPr>
-            <w:tcW w:type="dxa" w:w="3024"/>
-            <w:shd w:val="clear" w:color="auto" w:fill="DEEBF7"/>
-          </w:tcPr>
-          <w:p>
-            <w:r>
-              <w:rPr>
-                <w:color w:val="404040"/>
-                <w:sz w:val="19"/>
-              </w:rPr>
-              <w:t>"2단계: 파서 구현해줘. PDF·TXT·DOCX·PPTX 지원"</w:t>
-            </w:r>
-          </w:p>
-        </w:tc>
-      </w:tr>
-      <w:tr>
-        <w:tc>
-          <w:tcPr>
-            <w:tcW w:type="dxa" w:w="3024"/>
-            <w:shd w:val="clear" w:color="auto" w:fill="FFFFFF"/>
-          </w:tcPr>
-          <w:p>
-            <w:r>
-              <w:rPr>
-                <w:color w:val="404040"/>
-                <w:sz w:val="19"/>
-              </w:rPr>
-              <w:t>2. 분석</w:t>
-            </w:r>
-          </w:p>
-        </w:tc>
-        <w:tc>
-          <w:tcPr>
-            <w:tcW w:type="dxa" w:w="3024"/>
-            <w:shd w:val="clear" w:color="auto" w:fill="FFFFFF"/>
-          </w:tcPr>
-          <w:p>
-            <w:r>
-              <w:rPr>
-                <w:color w:val="404040"/>
-                <w:sz w:val="19"/>
-              </w:rPr>
-              <w:t>OpenClaw 에이전트</w:t>
-            </w:r>
-          </w:p>
-        </w:tc>
-        <w:tc>
-          <w:tcPr>
-            <w:tcW w:type="dxa" w:w="3024"/>
-            <w:shd w:val="clear" w:color="auto" w:fill="FFFFFF"/>
-          </w:tcPr>
-          <w:p>
-            <w:r>
-              <w:rPr>
-                <w:color w:val="404040"/>
-                <w:sz w:val="19"/>
-              </w:rPr>
-              <w:t>요구사항 정리 → 코드 설계 → 구현 계획 수립</w:t>
-            </w:r>
-          </w:p>
-        </w:tc>
-      </w:tr>
-      <w:tr>
-        <w:tc>
-          <w:tcPr>
-            <w:tcW w:type="dxa" w:w="3024"/>
-            <w:shd w:val="clear" w:color="auto" w:fill="DEEBF7"/>
-          </w:tcPr>
-          <w:p>
-            <w:r>
-              <w:rPr>
-                <w:color w:val="404040"/>
-                <w:sz w:val="19"/>
-              </w:rPr>
-              <w:t>3. 실행</w:t>
-            </w:r>
-          </w:p>
-        </w:tc>
-        <w:tc>
-          <w:tcPr>
-            <w:tcW w:type="dxa" w:w="3024"/>
-            <w:shd w:val="clear" w:color="auto" w:fill="DEEBF7"/>
-          </w:tcPr>
-          <w:p>
-            <w:r>
-              <w:rPr>
-                <w:color w:val="404040"/>
-                <w:sz w:val="19"/>
-              </w:rPr>
-              <w:t>Claude Code (로컬 PC)</w:t>
-            </w:r>
-          </w:p>
-        </w:tc>
-        <w:tc>
-          <w:tcPr>
-            <w:tcW w:type="dxa" w:w="3024"/>
-            <w:shd w:val="clear" w:color="auto" w:fill="DEEBF7"/>
-          </w:tcPr>
-          <w:p>
-            <w:r>
-              <w:rPr>
-                <w:color w:val="404040"/>
-                <w:sz w:val="19"/>
-              </w:rPr>
-              <w:t>src/parsers.py 자동 생성 및 테스트 실행</w:t>
-            </w:r>
-          </w:p>
-        </w:tc>
-      </w:tr>
-      <w:tr>
-        <w:tc>
-          <w:tcPr>
-            <w:tcW w:type="dxa" w:w="3024"/>
-            <w:shd w:val="clear" w:color="auto" w:fill="FFFFFF"/>
-          </w:tcPr>
-          <w:p>
-            <w:r>
-              <w:rPr>
-                <w:color w:val="404040"/>
-                <w:sz w:val="19"/>
-              </w:rPr>
-              <w:t>4. 보고</w:t>
-            </w:r>
-          </w:p>
-        </w:tc>
-        <w:tc>
-          <w:tcPr>
-            <w:tcW w:type="dxa" w:w="3024"/>
-            <w:shd w:val="clear" w:color="auto" w:fill="FFFFFF"/>
-          </w:tcPr>
-          <w:p>
-            <w:r>
-              <w:rPr>
-                <w:color w:val="404040"/>
-                <w:sz w:val="19"/>
-              </w:rPr>
-              <w:t>외부 (텔레그램)</w:t>
-            </w:r>
-          </w:p>
-        </w:tc>
-        <w:tc>
-          <w:tcPr>
-            <w:tcW w:type="dxa" w:w="3024"/>
-            <w:shd w:val="clear" w:color="auto" w:fill="FFFFFF"/>
-          </w:tcPr>
-          <w:p>
-            <w:r>
-              <w:rPr>
-                <w:color w:val="404040"/>
-                <w:sz w:val="19"/>
-              </w:rPr>
-              <w:t>"파서 완료. 30/30개 성공. 다음 단계 진행?"</w:t>
             </w:r>
           </w:p>
         </w:tc>
@@ -6574,7 +7233,7 @@
                 <w:color w:val="404040"/>
                 <w:sz w:val="19"/>
               </w:rPr>
-              <w:t>7단계: 배포</w:t>
+              <w:t>7단계: GitHub 배포</w:t>
             </w:r>
           </w:p>
         </w:tc>
@@ -6589,7 +7248,7 @@
                 <w:color w:val="404040"/>
                 <w:sz w:val="19"/>
               </w:rPr>
-              <w:t>GitHub 푸시·Vercel 데모</w:t>
+              <w:t>소스코드 GitHub 공개 및 버전 관리</w:t>
             </w:r>
           </w:p>
         </w:tc>
@@ -6604,7 +7263,7 @@
                 <w:color w:val="404040"/>
                 <w:sz w:val="19"/>
               </w:rPr>
-              <w:t>공개 URL 접근 가능</w:t>
+              <w:t>GitHub 리포지토리 접근 가능</w:t>
             </w:r>
           </w:p>
         </w:tc>
@@ -8358,6 +9017,136 @@
         <w:t>🚀  7단계: GitHub 배포</w:t>
       </w:r>
     </w:p>
+    <w:p>
+      <w:pPr>
+        <w:spacing w:after="120"/>
+      </w:pPr>
+      <w:r>
+        <w:rPr>
+          <w:b w:val="0"/>
+          <w:color w:val="404040"/>
+          <w:sz w:val="21"/>
+        </w:rPr>
+        <w:t>보안 원칙상 Streamlit + Ollama 기반 로컬 시스템은 외부 서버리스 플랫폼(Vercel 등)에 배포할 수 없습니다. 소스코드만 GitHub에 공개하여 버전 관리 및 재현성을 확보했습니다.</w:t>
+      </w:r>
+    </w:p>
+    <w:tbl>
+      <w:tblPr>
+        <w:tblW w:type="auto" w:w="0"/>
+        <w:jc w:val="left"/>
+        <w:tblLook w:firstColumn="1" w:firstRow="1" w:lastColumn="0" w:lastRow="0" w:noHBand="0" w:noVBand="1" w:val="04A0"/>
+        <w:tblBorders>
+          <w:top w:val="single" w:sz="8" w:color="C55A11"/>
+          <w:left w:val="single" w:sz="8" w:color="C55A11"/>
+          <w:bottom w:val="single" w:sz="8" w:color="C55A11"/>
+          <w:right w:val="single" w:sz="8" w:color="C55A11"/>
+          <w:insideH w:val="single" w:sz="8" w:color="C55A11"/>
+          <w:insideV w:val="single" w:sz="8" w:color="C55A11"/>
+        </w:tblBorders>
+      </w:tblPr>
+      <w:tblGrid>
+        <w:gridCol w:w="9072"/>
+      </w:tblGrid>
+      <w:tr>
+        <w:tc>
+          <w:tcPr>
+            <w:tcW w:type="dxa" w:w="9071"/>
+            <w:shd w:val="clear" w:color="auto" w:fill="FCE4D6"/>
+          </w:tcPr>
+          <w:p>
+            <w:pPr>
+              <w:spacing w:before="40" w:after="40"/>
+            </w:pPr>
+            <w:r>
+              <w:rPr>
+                <w:sz w:val="20"/>
+              </w:rPr>
+              <w:t>⚠️  Vercel·클라우드 배포가 불가능한 이유</w:t>
+            </w:r>
+          </w:p>
+          <w:p>
+            <w:pPr>
+              <w:spacing w:before="40" w:after="40"/>
+            </w:pPr>
+            <w:r>
+              <w:rPr>
+                <w:sz w:val="20"/>
+              </w:rPr>
+            </w:r>
+          </w:p>
+          <w:p>
+            <w:pPr>
+              <w:spacing w:before="40" w:after="40"/>
+            </w:pPr>
+            <w:r>
+              <w:rPr>
+                <w:sz w:val="20"/>
+              </w:rPr>
+              <w:t xml:space="preserve">  1. Streamlit 앱은 지속적인 WebSocket 서버가 필요  →  Vercel 서버리스 구조 불가</w:t>
+            </w:r>
+          </w:p>
+          <w:p>
+            <w:pPr>
+              <w:spacing w:before="40" w:after="40"/>
+            </w:pPr>
+            <w:r>
+              <w:rPr>
+                <w:sz w:val="20"/>
+              </w:rPr>
+              <w:t xml:space="preserve">  2. Ollama 바이너리(5GB)를 서버리스 함수(50MB 제한)에 올릴 수 없음</w:t>
+            </w:r>
+          </w:p>
+          <w:p>
+            <w:pPr>
+              <w:spacing w:before="40" w:after="40"/>
+            </w:pPr>
+            <w:r>
+              <w:rPr>
+                <w:sz w:val="20"/>
+              </w:rPr>
+              <w:t xml:space="preserve">  3. Chroma Vector DB는 영구 파일시스템 필요  →  Vercel /tmp(512MB, 휘발성) 불가</w:t>
+            </w:r>
+          </w:p>
+          <w:p>
+            <w:pPr>
+              <w:spacing w:before="40" w:after="40"/>
+            </w:pPr>
+            <w:r>
+              <w:rPr>
+                <w:sz w:val="20"/>
+              </w:rPr>
+              <w:t xml:space="preserve">  4. 기업 내부 문서를 외부 클라우드에 올리는 것 자체가 보안 위반</w:t>
+            </w:r>
+          </w:p>
+          <w:p>
+            <w:pPr>
+              <w:spacing w:before="40" w:after="40"/>
+            </w:pPr>
+            <w:r>
+              <w:rPr>
+                <w:sz w:val="20"/>
+              </w:rPr>
+            </w:r>
+          </w:p>
+          <w:p>
+            <w:pPr>
+              <w:spacing w:before="40" w:after="40"/>
+            </w:pPr>
+            <w:r>
+              <w:rPr>
+                <w:sz w:val="20"/>
+              </w:rPr>
+              <w:t>✅  해결 방법: GitHub에 소스코드 공개 → 사내 서버/개발자 PC에서 직접 실행</w:t>
+            </w:r>
+          </w:p>
+        </w:tc>
+      </w:tr>
+    </w:tbl>
+    <w:p>
+      <w:pPr>
+        <w:spacing w:after="80"/>
+      </w:pPr>
+    </w:p>
     <w:tbl>
       <w:tblPr>
         <w:tblW w:type="auto" w:w="0"/>
@@ -8539,7 +9328,7 @@
                 <w:color w:val="404040"/>
                 <w:sz w:val="19"/>
               </w:rPr>
-              <w:t>gh repo create local-enterprise-rag-chatbot</w:t>
+              <w:t>gh repo create local-enterprise-rag-chatbot --public</w:t>
             </w:r>
           </w:p>
         </w:tc>
@@ -8588,7 +9377,7 @@
                 <w:color w:val="404040"/>
                 <w:sz w:val="19"/>
               </w:rPr>
-              <w:t>⑥ Vercel 연동</w:t>
+              <w:t>⑥ 실행 방법 공유</w:t>
             </w:r>
           </w:p>
         </w:tc>
@@ -8603,7 +9392,7 @@
                 <w:color w:val="404040"/>
                 <w:sz w:val="19"/>
               </w:rPr>
-              <w:t>GitHub 리포지토리 → Vercel 자동 빌드 → 데모 URL 생성</w:t>
+              <w:t>README.md의 설치·실행 가이드를 팀원에게 전달</w:t>
             </w:r>
           </w:p>
         </w:tc>
@@ -12514,9 +13303,9 @@
           <w:color w:val="808080"/>
           <w:sz w:val="18"/>
         </w:rPr>
-        <w:t>이 매뉴얼은 AI 도구(OpenClaw 에이전트 + Claude Code)를 활용한 바이브코딩으로 제작되었습니다.</w:t>
+        <w:t>이 매뉴얼은 AI 도구(텔레그램 → OpenClaw 에이전트 + Claude Code)를 활용한 바이브코딩으로 제작되었습니다.</w:t>
         <w:br/>
-        <w:t>개발 환경: VSCode + Codex/Claude Code  |  데모 배포: GitHub + Vercel</w:t>
+        <w:t>개발 환경: VSCode + Claude Code  |  원격 지시: 텔레그램 → OpenClaw  |  코드 공유: GitHub</w:t>
       </w:r>
     </w:p>
     <w:sectPr>

</xml_diff>